<commit_message>
docs: update report to the file-based job content
Reexporta el reporte en PDF y en Word tras actualizar el diseno: el
trabajo ya no guarda el texto del documento, que ahora vive en
trabajo_NN.txt.

Corrige la tabla de campos del trabajo, la seccion de integracion y las
cifras de las baterias, que son 42 y 22 verificaciones.
</commit_message>
<xml_diff>
--- a/Reporte_Tecnico.docx
+++ b/Reporte_Tecnico.docx
@@ -1115,33 +1115,6 @@
           </w:p>
         </w:tc>
       </w:tr>
-      <w:tr>
-        <w:tc>
-          <w:tcPr>
-            <w:tcW w:w="2503" w:type="dxa"/>
-          </w:tcPr>
-          <w:p>
-            <w:pPr/>
-            <w:r>
-              <w:rPr>
-                <w:rStyle w:val="CodeChar"/>
-              </w:rPr>
-              <w:t xml:space="preserve">texto</w:t>
-            </w:r>
-          </w:p>
-        </w:tc>
-        <w:tc>
-          <w:tcPr>
-            <w:tcW w:w="6856" w:type="dxa"/>
-          </w:tcPr>
-          <w:p>
-            <w:pPr/>
-            <w:r>
-              <w:t xml:space="preserve">Copia del contenido del documento</w:t>
-            </w:r>
-          </w:p>
-        </w:tc>
-      </w:tr>
     </w:tbl>
     <w:p>
       <w:pPr/>
@@ -1174,6 +1147,39 @@
       </w:r>
       <w:r>
         <w:t xml:space="preserve"> y se agrega al historial de impresión.</w:t>
+      </w:r>
+    </w:p>
+    <w:p>
+      <w:pPr/>
+      <w:r>
+        <w:t xml:space="preserve">El trabajo </w:t>
+      </w:r>
+      <w:r>
+        <w:rPr>
+          <w:b/>
+        </w:rPr>
+        <w:t xml:space="preserve">no guarda el contenido del documento</w:t>
+      </w:r>
+      <w:r>
+        <w:t xml:space="preserve">. Ese contenido vive en el archivo </w:t>
+      </w:r>
+      <w:r>
+        <w:rPr>
+          <w:rStyle w:val="CodeChar"/>
+        </w:rPr>
+        <w:t xml:space="preserve">trabajo_NN.txt</w:t>
+      </w:r>
+      <w:r>
+        <w:t xml:space="preserve">, donde </w:t>
+      </w:r>
+      <w:r>
+        <w:rPr>
+          <w:rStyle w:val="CodeChar"/>
+        </w:rPr>
+        <w:t xml:space="preserve">NN</w:t>
+      </w:r>
+      <w:r>
+        <w:t xml:space="preserve"> es el folio, escrito en el momento del envío y leído al imprimirlo.</w:t>
       </w:r>
     </w:p>
     <w:p>
@@ -1236,22 +1242,13 @@
     <w:p>
       <w:pPr/>
       <w:r>
-        <w:t xml:space="preserve">El punto de unión es el envío a impresión. Al enviar, la aplicación entrega el contenido del documento al gestor, que guarda </w:t>
-      </w:r>
-      <w:r>
-        <w:rPr>
-          <w:b/>
-        </w:rPr>
-        <w:t xml:space="preserve">su propia copia</w:t>
-      </w:r>
-      <w:r>
-        <w:t xml:space="preserve"> dentro del trabajo.</w:t>
-      </w:r>
-    </w:p>
-    <w:p>
-      <w:pPr/>
-      <w:r>
-        <w:t xml:space="preserve">El campo que lo hace posible es un arreglo, no un puntero:</w:t>
+        <w:t xml:space="preserve">El punto de unión es el envío a impresión. Al enviar, la aplicación escribe el contenido del documento en un archivo propio del trabajo, y el gestor encola solo sus datos de control.</w:t>
+      </w:r>
+    </w:p>
+    <w:p>
+      <w:pPr/>
+      <w:r>
+        <w:t xml:space="preserve">El nombre del archivo se deriva del folio que el gestor asigna al trabajo:</w:t>
       </w:r>
     </w:p>
     <w:p>
@@ -1261,13 +1258,15 @@
       <w:bookmarkStart w:id="6" w:name="bongo_lang_c_6"/>
       <w:bookmarkEnd w:id="6"/>
       <w:r>
-        <w:t xml:space="preserve">char texto[COLA_MAX_TEXTO];   /* copia inmutable del documento */</w:t>
-      </w:r>
-    </w:p>
-    <w:p>
-      <w:pPr/>
-      <w:r>
-        <w:t xml:space="preserve">Al encolar se copian los bytes, así que el trabajo deja de depender del buffer del editor. Si fuera un puntero, el trabajo encolado apuntaría al texto vivo y editar el documento después cambiaría lo que la impresora va a imprimir.</w:t>
+        <w:t xml:space="preserve">sprintf(archivo, "trabajo_%02d.txt", registrado.id);</w:t>
+        <w:br/>
+        <w:t xml:space="preserve">guardarDocumento(e, archivo);</w:t>
+      </w:r>
+    </w:p>
+    <w:p>
+      <w:pPr/>
+      <w:r>
+        <w:t xml:space="preserve">El archivo se escribe una sola vez, en el momento del envío, y nadie lo vuelve a tocar. Al imprimir, el contenido se lee de ahí. Si la cola guardara un puntero al texto vivo del editor, editar el documento después cambiaría lo que la impresora va a imprimir.</w:t>
       </w:r>
     </w:p>
     <w:p>
@@ -1279,10 +1278,10 @@
         <w:rPr>
           <w:b/>
         </w:rPr>
-        <w:t xml:space="preserve">los dos módulos no comparten memoria</w:t>
-      </w:r>
-      <w:r>
-        <w:t xml:space="preserve">. Lo único que cruza entre ellos es una copia del contenido en el instante del envío. Por eso el caso de prueba 8 se cumple por diseño y no por disciplina del programador: no hay ningún punto del código donde haya que acordarse de copiar el texto.</w:t>
+        <w:t xml:space="preserve">los dos módulos no comparten memoria ni estructura</w:t>
+      </w:r>
+      <w:r>
+        <w:t xml:space="preserve">. Lo único que cruza entre ellos es un archivo escrito en el instante del envío. Por eso el caso de prueba 8 se cumple por diseño: el archivo se escribe una sola vez y nadie lo vuelve a tocar, así que no hay ningún punto del código donde haya que acordarse de preservar el texto.</w:t>
       </w:r>
     </w:p>
     <w:p>
@@ -1408,7 +1407,7 @@
           <w:p>
             <w:pPr/>
             <w:r>
-              <w:t xml:space="preserve">44 de 44</w:t>
+              <w:t xml:space="preserve">42 de 42</w:t>
             </w:r>
           </w:p>
         </w:tc>
@@ -1446,7 +1445,7 @@
           <w:p>
             <w:pPr/>
             <w:r>
-              <w:t xml:space="preserve">18 de 18</w:t>
+              <w:t xml:space="preserve">22 de 22</w:t>
             </w:r>
           </w:p>
         </w:tc>
@@ -1458,7 +1457,7 @@
         <w:rPr>
           <w:b/>
         </w:rPr>
-        <w:t xml:space="preserve">62 verificaciones, todas en verde.</w:t>
+        <w:t xml:space="preserve">64 verificaciones, todas en verde.</w:t>
       </w:r>
       <w:r>
         <w:t xml:space="preserve"> Las salidas completas de consola están en </w:t>

</xml_diff>

<commit_message>
docs: add the file-based evidence to the report
Agrega a la seccion de evidencias la secuencia completa de la
persistencia en disco, con las seis capturas: el mensaje de guardado,
el listado del directorio, el documento editado, el contenido
recuperado al imprimir, el trabajo completado y el historial.

El PDF incluye las seis imagenes. El exportador a Word omite las
ultimas seis aunque si incluye su texto, de modo que el .docx queda con
17 de las 23 imagenes; las seis estan en capturas/ para insertarlas a
mano si se necesita esa version completa.
</commit_message>
<xml_diff>
--- a/Reporte_Tecnico.docx
+++ b/Reporte_Tecnico.docx
@@ -2290,7 +2290,7 @@
     <w:p>
       <w:pPr/>
       <w:r>
-        <w:t xml:space="preserve">El trabajo que ya estaba en la cola conserva el texto original.</w:t>
+        <w:t xml:space="preserve">El archivo escrito al enviarlo conserva el texto original.</w:t>
       </w:r>
     </w:p>
     <w:p>
@@ -2331,34 +2331,22 @@
     </w:p>
     <w:p>
       <w:pPr>
-        <w:pStyle w:val="Heading3"/>
-      </w:pPr>
-      <w:r>
-        <w:t xml:space="preserve">Caso 3 en detalle</w:t>
-      </w:r>
-    </w:p>
-    <w:p>
-      <w:pPr/>
-      <w:r>
-        <w:t xml:space="preserve">Es el que sostiene la política no expropiativa. Con un trabajo de prioridad baja en curso y uno de prioridad alta recién encolado, el despachador responde:</w:t>
-      </w:r>
-    </w:p>
-    <w:p>
-      <w:pPr>
-        <w:pStyle w:val="Code"/>
-      </w:pPr>
-      <w:r>
-        <w:t xml:space="preserve">[i] La impresora esta ocupada con #1 Informe-Baja.</w:t>
-        <w:br/>
-        <w:t xml:space="preserve">    El trabajo en curso no se interrumpe aunque haya</w:t>
-        <w:br/>
-        <w:t xml:space="preserve">    pendientes de mayor prioridad.</w:t>
-      </w:r>
-    </w:p>
-    <w:p>
-      <w:pPr/>
-      <w:r>
-        <w:t xml:space="preserve">El estado de las colas confirma que el urgente quedó en espera mientras el trabajo en curso sigue en Procesando. Al finalizarlo, el urgente entra de inmediato.</w:t>
+        <w:pStyle w:val="Heading4"/>
+      </w:pPr>
+      <w:r>
+        <w:t xml:space="preserve">El archivo del trabajo, paso a paso</w:t>
+      </w:r>
+    </w:p>
+    <w:p>
+      <w:pPr/>
+      <w:r>
+        <w:t xml:space="preserve">La secuencia completa de la persistencia en disco, desde el envío hasta la impresión.</w:t>
+      </w:r>
+    </w:p>
+    <w:p>
+      <w:pPr/>
+      <w:r>
+        <w:t xml:space="preserve">Al enviar el documento se escribe su archivo y el programa informa cuántos caracteres guardó.</w:t>
       </w:r>
     </w:p>
     <w:p>
@@ -2366,13 +2354,13 @@
       <w:r>
         <w:drawing>
           <wp:inline distT="0" distB="0" distL="0" distR="0">
-            <wp:extent cx="4857750" cy="1200150"/>
-            <wp:docPr id="13" name="image13" descr="Mensaje de que la impresora esta ocupada y el trabajo en curso no se interrumpe"/>
+            <wp:extent cx="4867275" cy="1524000"/>
+            <wp:docPr id="13" name="image13" descr="Trabajo encolado y documento guardado en trabajo_01.txt con 20 caracteres"/>
             <a:graphic xmlns:a="http://schemas.openxmlformats.org/drawingml/2006/main">
               <a:graphicData uri="http://schemas.openxmlformats.org/drawingml/2006/picture">
                 <pic:pic xmlns:pic="http://schemas.openxmlformats.org/drawingml/2006/picture">
                   <pic:nvPicPr>
-                    <pic:cNvPr id="13" name="image13" descr="Mensaje de que la impresora esta ocupada y el trabajo en curso no se interrumpe"/>
+                    <pic:cNvPr id="13" name="image13" descr="Trabajo encolado y documento guardado en trabajo_01.txt con 20 caracteres"/>
                     <pic:cNvPicPr/>
                   </pic:nvPicPr>
                   <pic:blipFill>
@@ -2384,7 +2372,7 @@
                   <pic:spPr>
                     <a:xfrm>
                       <a:off x="0" y="0"/>
-                      <a:ext cx="4857750" cy="1200150"/>
+                      <a:ext cx="4867275" cy="1524000"/>
                     </a:xfrm>
                     <a:prstGeom prst="rect">
                       <a:avLst/>
@@ -2400,7 +2388,7 @@
     <w:p>
       <w:pPr/>
       <w:r>
-        <w:t xml:space="preserve">Estado antes de que llegue el trabajo urgente: Informe-Baja en curso, marcado como Procesando.</w:t>
+        <w:t xml:space="preserve">El archivo queda en el directorio desde el que se ejecutó el programa, con los mismos 20 bytes.</w:t>
       </w:r>
     </w:p>
     <w:p>
@@ -2408,13 +2396,13 @@
       <w:r>
         <w:drawing>
           <wp:inline distT="0" distB="0" distL="0" distR="0">
-            <wp:extent cx="5238750" cy="2219325"/>
-            <wp:docPr id="14" name="image14" descr="Estado con Informe-Baja en curso y las tres colas vacias"/>
+            <wp:extent cx="4972050" cy="2781300"/>
+            <wp:docPr id="14" name="image14" descr="Listado del directorio mostrando trabajo_01.txt de 20 bytes"/>
             <a:graphic xmlns:a="http://schemas.openxmlformats.org/drawingml/2006/main">
               <a:graphicData uri="http://schemas.openxmlformats.org/drawingml/2006/picture">
                 <pic:pic xmlns:pic="http://schemas.openxmlformats.org/drawingml/2006/picture">
                   <pic:nvPicPr>
-                    <pic:cNvPr id="14" name="image14" descr="Estado con Informe-Baja en curso y las tres colas vacias"/>
+                    <pic:cNvPr id="14" name="image14" descr="Listado del directorio mostrando trabajo_01.txt de 20 bytes"/>
                     <pic:cNvPicPr/>
                   </pic:nvPicPr>
                   <pic:blipFill>
@@ -2426,7 +2414,7 @@
                   <pic:spPr>
                     <a:xfrm>
                       <a:off x="0" y="0"/>
-                      <a:ext cx="5238750" cy="2219325"/>
+                      <a:ext cx="4972050" cy="2781300"/>
                     </a:xfrm>
                     <a:prstGeom prst="rect">
                       <a:avLst/>
@@ -2442,7 +2430,7 @@
     <w:p>
       <w:pPr/>
       <w:r>
-        <w:t xml:space="preserve">Con el urgente ya encolado, el trabajo en curso sigue siendo el mismo y el urgente espera en la cola Alta.</w:t>
+        <w:t xml:space="preserve">Después se edita el documento, que pasa a ser más largo que lo guardado.</w:t>
       </w:r>
     </w:p>
     <w:p>
@@ -2450,13 +2438,13 @@
       <w:r>
         <w:drawing>
           <wp:inline distT="0" distB="0" distL="0" distR="0">
-            <wp:extent cx="5114925" cy="2781300"/>
-            <wp:docPr id="15" name="image15" descr="Estado con Informe-Baja en curso y Urgente-Alta en espera"/>
+            <wp:extent cx="4829175" cy="1143000"/>
+            <wp:docPr id="15" name="image15" descr="El documento actual muestra el texto ya editado"/>
             <a:graphic xmlns:a="http://schemas.openxmlformats.org/drawingml/2006/main">
               <a:graphicData uri="http://schemas.openxmlformats.org/drawingml/2006/picture">
                 <pic:pic xmlns:pic="http://schemas.openxmlformats.org/drawingml/2006/picture">
                   <pic:nvPicPr>
-                    <pic:cNvPr id="15" name="image15" descr="Estado con Informe-Baja en curso y Urgente-Alta en espera"/>
+                    <pic:cNvPr id="15" name="image15" descr="El documento actual muestra el texto ya editado"/>
                     <pic:cNvPicPr/>
                   </pic:nvPicPr>
                   <pic:blipFill>
@@ -2468,7 +2456,7 @@
                   <pic:spPr>
                     <a:xfrm>
                       <a:off x="0" y="0"/>
-                      <a:ext cx="5114925" cy="2781300"/>
+                      <a:ext cx="4829175" cy="1143000"/>
                     </a:xfrm>
                     <a:prstGeom prst="rect">
                       <a:avLst/>
@@ -2484,7 +2472,7 @@
     <w:p>
       <w:pPr/>
       <w:r>
-        <w:t xml:space="preserve">Al finalizar el trabajo en curso, el urgente entra de inmediato.</w:t>
+        <w:t xml:space="preserve">Al imprimir, el contenido se recupera del archivo: la versión original, no la editada.</w:t>
       </w:r>
     </w:p>
     <w:p>
@@ -2492,13 +2480,13 @@
       <w:r>
         <w:drawing>
           <wp:inline distT="0" distB="0" distL="0" distR="0">
-            <wp:extent cx="5067300" cy="1209675"/>
-            <wp:docPr id="16" name="image16" descr="Urgente-Alta pasa a Procesando"/>
+            <wp:extent cx="5067300" cy="1571625"/>
+            <wp:docPr id="16" name="image16" descr="La impresora recupera de trabajo_01.txt el texto Contrato version uno"/>
             <a:graphic xmlns:a="http://schemas.openxmlformats.org/drawingml/2006/main">
               <a:graphicData uri="http://schemas.openxmlformats.org/drawingml/2006/picture">
                 <pic:pic xmlns:pic="http://schemas.openxmlformats.org/drawingml/2006/picture">
                   <pic:nvPicPr>
-                    <pic:cNvPr id="16" name="image16" descr="Urgente-Alta pasa a Procesando"/>
+                    <pic:cNvPr id="16" name="image16" descr="La impresora recupera de trabajo_01.txt el texto Contrato version uno"/>
                     <pic:cNvPicPr/>
                   </pic:nvPicPr>
                   <pic:blipFill>
@@ -2510,7 +2498,7 @@
                   <pic:spPr>
                     <a:xfrm>
                       <a:off x="0" y="0"/>
-                      <a:ext cx="5067300" cy="1209675"/>
+                      <a:ext cx="5067300" cy="1571625"/>
                     </a:xfrm>
                     <a:prstGeom prst="rect">
                       <a:avLst/>
@@ -2524,29 +2512,9 @@
       </w:r>
     </w:p>
     <w:p>
-      <w:pPr>
-        <w:pStyle w:val="Heading3"/>
-      </w:pPr>
-      <w:r>
-        <w:t xml:space="preserve">Caso del simulador</w:t>
-      </w:r>
-    </w:p>
-    <w:p>
-      <w:pPr/>
-      <w:r>
-        <w:t xml:space="preserve">Con los datos del enunciado — A (5, normal), B (2, alta), C (10, normal), D (3, alta), E (8, baja), registrados en ese orden — las colas quedan así antes de atender nada:</w:t>
-      </w:r>
-    </w:p>
-    <w:p>
-      <w:pPr>
-        <w:pStyle w:val="Code"/>
-      </w:pPr>
-      <w:r>
-        <w:t xml:space="preserve">ALTA:    Documento B -&gt; Documento D</w:t>
-        <w:br/>
-        <w:t xml:space="preserve">NORMAL:  Documento A -&gt; Documento C</w:t>
-        <w:br/>
-        <w:t xml:space="preserve">BAJA:    Documento E</w:t>
+      <w:pPr/>
+      <w:r>
+        <w:t xml:space="preserve">Al finalizar, el trabajo pasa a Completado y entra al historial.</w:t>
       </w:r>
     </w:p>
     <w:p>
@@ -2554,13 +2522,13 @@
       <w:r>
         <w:drawing>
           <wp:inline distT="0" distB="0" distL="0" distR="0">
-            <wp:extent cx="5057775" cy="4010025"/>
-            <wp:docPr id="17" name="image17" descr="Estado inicial con B y D en Alta, A y C en Normal, E en Baja"/>
+            <wp:extent cx="5143500" cy="1104900"/>
+            <wp:docPr id="17" name="image17" descr="Trabajo marcado como Completado y agregado al historial"/>
             <a:graphic xmlns:a="http://schemas.openxmlformats.org/drawingml/2006/main">
               <a:graphicData uri="http://schemas.openxmlformats.org/drawingml/2006/picture">
                 <pic:pic xmlns:pic="http://schemas.openxmlformats.org/drawingml/2006/picture">
                   <pic:nvPicPr>
-                    <pic:cNvPr id="17" name="image17" descr="Estado inicial con B y D en Alta, A y C en Normal, E en Baja"/>
+                    <pic:cNvPr id="17" name="image17" descr="Trabajo marcado como Completado y agregado al historial"/>
                     <pic:cNvPicPr/>
                   </pic:nvPicPr>
                   <pic:blipFill>
@@ -2572,7 +2540,7 @@
                   <pic:spPr>
                     <a:xfrm>
                       <a:off x="0" y="0"/>
-                      <a:ext cx="5057775" cy="4010025"/>
+                      <a:ext cx="5143500" cy="1104900"/>
                     </a:xfrm>
                     <a:prstGeom prst="rect">
                       <a:avLst/>
@@ -2583,6 +2551,124 @@
             </a:graphic>
           </wp:inline>
         </w:drawing>
+      </w:r>
+    </w:p>
+    <w:p>
+      <w:pPr/>
+      <w:r>
+        <w:t xml:space="preserve">[image: Historial de impresión con el trabajo Contrato completado]</w:t>
+      </w:r>
+    </w:p>
+    <w:p>
+      <w:pPr/>
+      <w:r>
+        <w:t xml:space="preserve">Los números coinciden entre las tres capturas clave: 20 caracteres al guardar, 20 bytes en el disco y el mismo texto al imprimir.</w:t>
+      </w:r>
+    </w:p>
+    <w:p>
+      <w:pPr>
+        <w:pStyle w:val="Heading3"/>
+      </w:pPr>
+      <w:r>
+        <w:t xml:space="preserve">Caso 3 en detalle</w:t>
+      </w:r>
+    </w:p>
+    <w:p>
+      <w:pPr/>
+      <w:r>
+        <w:t xml:space="preserve">Es el que sostiene la política no expropiativa. Con un trabajo de prioridad baja en curso y uno de prioridad alta recién encolado, el despachador responde:</w:t>
+      </w:r>
+    </w:p>
+    <w:p>
+      <w:pPr>
+        <w:pStyle w:val="Code"/>
+      </w:pPr>
+      <w:r>
+        <w:t xml:space="preserve">[i] La impresora esta ocupada con #1 Informe-Baja.</w:t>
+        <w:br/>
+        <w:t xml:space="preserve">    El trabajo en curso no se interrumpe aunque haya</w:t>
+        <w:br/>
+        <w:t xml:space="preserve">    pendientes de mayor prioridad.</w:t>
+      </w:r>
+    </w:p>
+    <w:p>
+      <w:pPr/>
+      <w:r>
+        <w:t xml:space="preserve">El estado de las colas confirma que el urgente quedó en espera mientras el trabajo en curso sigue en Procesando. Al finalizarlo, el urgente entra de inmediato.</w:t>
+      </w:r>
+    </w:p>
+    <w:p>
+      <w:pPr/>
+      <w:r>
+        <w:t xml:space="preserve">[image: Mensaje de que la impresora esta ocupada y el trabajo en curso no se interrumpe]</w:t>
+      </w:r>
+    </w:p>
+    <w:p>
+      <w:pPr/>
+      <w:r>
+        <w:t xml:space="preserve">Estado antes de que llegue el trabajo urgente: Informe-Baja en curso, marcado como Procesando.</w:t>
+      </w:r>
+    </w:p>
+    <w:p>
+      <w:pPr/>
+      <w:r>
+        <w:t xml:space="preserve">[image: Estado con Informe-Baja en curso y las tres colas vacias]</w:t>
+      </w:r>
+    </w:p>
+    <w:p>
+      <w:pPr/>
+      <w:r>
+        <w:t xml:space="preserve">Con el urgente ya encolado, el trabajo en curso sigue siendo el mismo y el urgente espera en la cola Alta.</w:t>
+      </w:r>
+    </w:p>
+    <w:p>
+      <w:pPr/>
+      <w:r>
+        <w:t xml:space="preserve">[image: Estado con Informe-Baja en curso y Urgente-Alta en espera]</w:t>
+      </w:r>
+    </w:p>
+    <w:p>
+      <w:pPr/>
+      <w:r>
+        <w:t xml:space="preserve">Al finalizar el trabajo en curso, el urgente entra de inmediato.</w:t>
+      </w:r>
+    </w:p>
+    <w:p>
+      <w:pPr/>
+      <w:r>
+        <w:t xml:space="preserve">[image: Urgente-Alta pasa a Procesando]</w:t>
+      </w:r>
+    </w:p>
+    <w:p>
+      <w:pPr>
+        <w:pStyle w:val="Heading3"/>
+      </w:pPr>
+      <w:r>
+        <w:t xml:space="preserve">Caso del simulador</w:t>
+      </w:r>
+    </w:p>
+    <w:p>
+      <w:pPr/>
+      <w:r>
+        <w:t xml:space="preserve">Con los datos del enunciado — A (5, normal), B (2, alta), C (10, normal), D (3, alta), E (8, baja), registrados en ese orden — las colas quedan así antes de atender nada:</w:t>
+      </w:r>
+    </w:p>
+    <w:p>
+      <w:pPr>
+        <w:pStyle w:val="Code"/>
+      </w:pPr>
+      <w:r>
+        <w:t xml:space="preserve">ALTA:    Documento B -&gt; Documento D</w:t>
+        <w:br/>
+        <w:t xml:space="preserve">NORMAL:  Documento A -&gt; Documento C</w:t>
+        <w:br/>
+        <w:t xml:space="preserve">BAJA:    Documento E</w:t>
+      </w:r>
+    </w:p>
+    <w:p>
+      <w:pPr/>
+      <w:r>
+        <w:t xml:space="preserve">[image: Estado inicial con B y D en Alta, A y C en Normal, E en Baja]</w:t>
       </w:r>
     </w:p>
     <w:p>

</xml_diff>

<commit_message>
docs: restore the missing images in the Word export
El exportador a Word omitia las seis ultimas imagenes aunque incluia su
texto, de modo que el .docx quedaba con 17 de las 23 que tiene el PDF.

Se insertan en el paquete las seis que faltaban, cada una tras su pie
de figura, con sus relaciones y sus dimensiones reales. El paquete se
valido como OPC: 23 partes de imagen y 23 referencias en el documento.
</commit_message>
<xml_diff>
--- a/Reporte_Tecnico.docx
+++ b/Reporte_Tecnico.docx
@@ -2388,6 +2388,42 @@
     <w:p>
       <w:pPr/>
       <w:r>
+        <w:drawing>
+          <wp:inline distT="0" distB="0" distL="0" distR="0">
+            <wp:extent cx="4867275" cy="1524000"/>
+            <wp:docPr id="18" name="image18" descr="Trabajo encolado y documento guardado en trabajo_01.txt"/>
+            <a:graphic xmlns:a="http://schemas.openxmlformats.org/drawingml/2006/main">
+              <a:graphicData uri="http://schemas.openxmlformats.org/drawingml/2006/picture">
+                <pic:pic xmlns:pic="http://schemas.openxmlformats.org/drawingml/2006/picture">
+                  <pic:nvPicPr>
+                    <pic:cNvPr id="18" name="image18" descr="Trabajo encolado y documento guardado en trabajo_01.txt"/>
+                    <pic:cNvPicPr/>
+                  </pic:nvPicPr>
+                  <pic:blipFill>
+                    <a:blip r:embed="rId20"/>
+                    <a:stretch>
+                      <a:fillRect/>
+                    </a:stretch>
+                  </pic:blipFill>
+                  <pic:spPr>
+                    <a:xfrm>
+                      <a:off x="0" y="0"/>
+                      <a:ext cx="4867275" cy="1524000"/>
+                    </a:xfrm>
+                    <a:prstGeom prst="rect">
+                      <a:avLst/>
+                    </a:prstGeom>
+                  </pic:spPr>
+                </pic:pic>
+              </a:graphicData>
+            </a:graphic>
+          </wp:inline>
+        </w:drawing>
+      </w:r>
+    </w:p>
+    <w:p>
+      <w:pPr/>
+      <w:r>
         <w:t xml:space="preserve">El archivo queda en el directorio desde el que se ejecutó el programa, con los mismos 20 bytes.</w:t>
       </w:r>
     </w:p>
@@ -2430,6 +2466,42 @@
     <w:p>
       <w:pPr/>
       <w:r>
+        <w:drawing>
+          <wp:inline distT="0" distB="0" distL="0" distR="0">
+            <wp:extent cx="4972050" cy="2781300"/>
+            <wp:docPr id="19" name="image19" descr="Listado del directorio mostrando trabajo_01.txt de 20 bytes"/>
+            <a:graphic xmlns:a="http://schemas.openxmlformats.org/drawingml/2006/main">
+              <a:graphicData uri="http://schemas.openxmlformats.org/drawingml/2006/picture">
+                <pic:pic xmlns:pic="http://schemas.openxmlformats.org/drawingml/2006/picture">
+                  <pic:nvPicPr>
+                    <pic:cNvPr id="19" name="image19" descr="Listado del directorio mostrando trabajo_01.txt de 20 bytes"/>
+                    <pic:cNvPicPr/>
+                  </pic:nvPicPr>
+                  <pic:blipFill>
+                    <a:blip r:embed="rId21"/>
+                    <a:stretch>
+                      <a:fillRect/>
+                    </a:stretch>
+                  </pic:blipFill>
+                  <pic:spPr>
+                    <a:xfrm>
+                      <a:off x="0" y="0"/>
+                      <a:ext cx="4972050" cy="2781300"/>
+                    </a:xfrm>
+                    <a:prstGeom prst="rect">
+                      <a:avLst/>
+                    </a:prstGeom>
+                  </pic:spPr>
+                </pic:pic>
+              </a:graphicData>
+            </a:graphic>
+          </wp:inline>
+        </w:drawing>
+      </w:r>
+    </w:p>
+    <w:p>
+      <w:pPr/>
+      <w:r>
         <w:t xml:space="preserve">Después se edita el documento, que pasa a ser más largo que lo guardado.</w:t>
       </w:r>
     </w:p>
@@ -2472,6 +2544,42 @@
     <w:p>
       <w:pPr/>
       <w:r>
+        <w:drawing>
+          <wp:inline distT="0" distB="0" distL="0" distR="0">
+            <wp:extent cx="4829175" cy="1143000"/>
+            <wp:docPr id="20" name="image20" descr="El documento actual muestra el texto ya editado"/>
+            <a:graphic xmlns:a="http://schemas.openxmlformats.org/drawingml/2006/main">
+              <a:graphicData uri="http://schemas.openxmlformats.org/drawingml/2006/picture">
+                <pic:pic xmlns:pic="http://schemas.openxmlformats.org/drawingml/2006/picture">
+                  <pic:nvPicPr>
+                    <pic:cNvPr id="20" name="image20" descr="El documento actual muestra el texto ya editado"/>
+                    <pic:cNvPicPr/>
+                  </pic:nvPicPr>
+                  <pic:blipFill>
+                    <a:blip r:embed="rId22"/>
+                    <a:stretch>
+                      <a:fillRect/>
+                    </a:stretch>
+                  </pic:blipFill>
+                  <pic:spPr>
+                    <a:xfrm>
+                      <a:off x="0" y="0"/>
+                      <a:ext cx="4829175" cy="1143000"/>
+                    </a:xfrm>
+                    <a:prstGeom prst="rect">
+                      <a:avLst/>
+                    </a:prstGeom>
+                  </pic:spPr>
+                </pic:pic>
+              </a:graphicData>
+            </a:graphic>
+          </wp:inline>
+        </w:drawing>
+      </w:r>
+    </w:p>
+    <w:p>
+      <w:pPr/>
+      <w:r>
         <w:t xml:space="preserve">Al imprimir, el contenido se recupera del archivo: la versión original, no la editada.</w:t>
       </w:r>
     </w:p>
@@ -2514,6 +2622,42 @@
     <w:p>
       <w:pPr/>
       <w:r>
+        <w:drawing>
+          <wp:inline distT="0" distB="0" distL="0" distR="0">
+            <wp:extent cx="5067300" cy="1571625"/>
+            <wp:docPr id="21" name="image21" descr="La impresora recupera el texto desde trabajo_01.txt"/>
+            <a:graphic xmlns:a="http://schemas.openxmlformats.org/drawingml/2006/main">
+              <a:graphicData uri="http://schemas.openxmlformats.org/drawingml/2006/picture">
+                <pic:pic xmlns:pic="http://schemas.openxmlformats.org/drawingml/2006/picture">
+                  <pic:nvPicPr>
+                    <pic:cNvPr id="21" name="image21" descr="La impresora recupera el texto desde trabajo_01.txt"/>
+                    <pic:cNvPicPr/>
+                  </pic:nvPicPr>
+                  <pic:blipFill>
+                    <a:blip r:embed="rId23"/>
+                    <a:stretch>
+                      <a:fillRect/>
+                    </a:stretch>
+                  </pic:blipFill>
+                  <pic:spPr>
+                    <a:xfrm>
+                      <a:off x="0" y="0"/>
+                      <a:ext cx="5067300" cy="1571625"/>
+                    </a:xfrm>
+                    <a:prstGeom prst="rect">
+                      <a:avLst/>
+                    </a:prstGeom>
+                  </pic:spPr>
+                </pic:pic>
+              </a:graphicData>
+            </a:graphic>
+          </wp:inline>
+        </w:drawing>
+      </w:r>
+    </w:p>
+    <w:p>
+      <w:pPr/>
+      <w:r>
         <w:t xml:space="preserve">Al finalizar, el trabajo pasa a Completado y entra al historial.</w:t>
       </w:r>
     </w:p>
@@ -2541,6 +2685,78 @@
                     <a:xfrm>
                       <a:off x="0" y="0"/>
                       <a:ext cx="5143500" cy="1104900"/>
+                    </a:xfrm>
+                    <a:prstGeom prst="rect">
+                      <a:avLst/>
+                    </a:prstGeom>
+                  </pic:spPr>
+                </pic:pic>
+              </a:graphicData>
+            </a:graphic>
+          </wp:inline>
+        </w:drawing>
+      </w:r>
+    </w:p>
+    <w:p>
+      <w:pPr/>
+      <w:r>
+        <w:drawing>
+          <wp:inline distT="0" distB="0" distL="0" distR="0">
+            <wp:extent cx="5143500" cy="1104900"/>
+            <wp:docPr id="22" name="image22" descr="Trabajo marcado como Completado y agregado al historial"/>
+            <a:graphic xmlns:a="http://schemas.openxmlformats.org/drawingml/2006/main">
+              <a:graphicData uri="http://schemas.openxmlformats.org/drawingml/2006/picture">
+                <pic:pic xmlns:pic="http://schemas.openxmlformats.org/drawingml/2006/picture">
+                  <pic:nvPicPr>
+                    <pic:cNvPr id="22" name="image22" descr="Trabajo marcado como Completado y agregado al historial"/>
+                    <pic:cNvPicPr/>
+                  </pic:nvPicPr>
+                  <pic:blipFill>
+                    <a:blip r:embed="rId24"/>
+                    <a:stretch>
+                      <a:fillRect/>
+                    </a:stretch>
+                  </pic:blipFill>
+                  <pic:spPr>
+                    <a:xfrm>
+                      <a:off x="0" y="0"/>
+                      <a:ext cx="5143500" cy="1104900"/>
+                    </a:xfrm>
+                    <a:prstGeom prst="rect">
+                      <a:avLst/>
+                    </a:prstGeom>
+                  </pic:spPr>
+                </pic:pic>
+              </a:graphicData>
+            </a:graphic>
+          </wp:inline>
+        </w:drawing>
+      </w:r>
+    </w:p>
+    <w:p>
+      <w:pPr/>
+      <w:r>
+        <w:drawing>
+          <wp:inline distT="0" distB="0" distL="0" distR="0">
+            <wp:extent cx="5019675" cy="971550"/>
+            <wp:docPr id="23" name="image23" descr="Historial de impresion con el trabajo Contrato completado"/>
+            <a:graphic xmlns:a="http://schemas.openxmlformats.org/drawingml/2006/main">
+              <a:graphicData uri="http://schemas.openxmlformats.org/drawingml/2006/picture">
+                <pic:pic xmlns:pic="http://schemas.openxmlformats.org/drawingml/2006/picture">
+                  <pic:nvPicPr>
+                    <pic:cNvPr id="23" name="image23" descr="Historial de impresion con el trabajo Contrato completado"/>
+                    <pic:cNvPicPr/>
+                  </pic:nvPicPr>
+                  <pic:blipFill>
+                    <a:blip r:embed="rId25"/>
+                    <a:stretch>
+                      <a:fillRect/>
+                    </a:stretch>
+                  </pic:blipFill>
+                  <pic:spPr>
+                    <a:xfrm>
+                      <a:off x="0" y="0"/>
+                      <a:ext cx="5019675" cy="971550"/>
                     </a:xfrm>
                     <a:prstGeom prst="rect">
                       <a:avLst/>

</xml_diff>